<commit_message>
Add workflow diagram support to process documents
Generator template:
- Added workflowDiagram() function: embeds PNG if exists, shows
  dashed placeholder if not
- Added ImageRun import and DIAGRAM_PATH config variable
- Updated header comments with diagram convention

Document Production Process (v1.1):
- Added section 4.3 Workflow Diagrams: convention, file naming,
  embedding behavior, and update procedure
- Updated version to 1.1, Last Updated to 03-30-26 23:00
</commit_message>
<xml_diff>
--- a/PRDs/application/CRM-Builder-Document-Production-Process.docx
+++ b/PRDs/application/CRM-Builder-Document-Production-Process.docx
@@ -176,7 +176,7 @@
                 <w:sz w:val="20"/>
                 <w:szCs w:val="20"/>
               </w:rPr>
-              <w:t xml:space="preserve">1.0</w:t>
+              <w:t xml:space="preserve">1.1</w:t>
             </w:r>
           </w:p>
         </w:tc>
@@ -298,7 +298,7 @@
                 <w:sz w:val="20"/>
                 <w:szCs w:val="20"/>
               </w:rPr>
-              <w:t xml:space="preserve">03-30-26 12:00</w:t>
+              <w:t xml:space="preserve">03-30-26 23:00</w:t>
             </w:r>
           </w:p>
         </w:tc>
@@ -4376,6 +4376,122 @@
           <w:szCs w:val="22"/>
         </w:rPr>
         <w:t xml:space="preserve">Claude produces the first draft of each document. After that, humans own it. The team may clean up formatting, add workflow diagrams, refine wording, and restructure sections as needed. If significant rework is required, the document can be brought back to Claude in a new conversation, but Claude is not the permanent custodian of the document.</w:t>
+      </w:r>
+    </w:p>
+    <w:p>
+      <w:pPr>
+        <w:pStyle w:val="Heading2"/>
+      </w:pPr>
+      <w:r>
+        <w:t xml:space="preserve">4.3 Workflow Diagrams</w:t>
+      </w:r>
+    </w:p>
+    <w:p>
+      <w:pPr>
+        <w:spacing w:after="120"/>
+      </w:pPr>
+      <w:r>
+        <w:rPr>
+          <w:rFonts w:ascii="Arial" w:cs="Arial" w:eastAsia="Arial" w:hAnsi="Arial"/>
+          <w:b w:val="false"/>
+          <w:bCs w:val="false"/>
+          <w:i w:val="false"/>
+          <w:iCs w:val="false"/>
+          <w:color w:val="404040"/>
+          <w:sz w:val="22"/>
+          <w:szCs w:val="22"/>
+        </w:rPr>
+        <w:t xml:space="preserve">Each process document includes a workflow diagram placed immediately after the Process Workflow section (Section 3). Diagrams provide a visual summary of the numbered workflow steps, decision points, and status transitions defined in the text.</w:t>
+      </w:r>
+    </w:p>
+    <w:p>
+      <w:pPr>
+        <w:spacing w:after="120"/>
+      </w:pPr>
+      <w:r>
+        <w:rPr>
+          <w:rFonts w:ascii="Arial" w:cs="Arial" w:eastAsia="Arial" w:hAnsi="Arial"/>
+          <w:b w:val="false"/>
+          <w:bCs w:val="false"/>
+          <w:i w:val="false"/>
+          <w:iCs w:val="false"/>
+          <w:color w:val="404040"/>
+          <w:sz w:val="22"/>
+          <w:szCs w:val="22"/>
+        </w:rPr>
+        <w:t xml:space="preserve">Diagrams are created in draw.io and stored alongside the process documents in the repository. Each process has two diagram files: a source file for editing and an exported PNG for embedding in the Word document.</w:t>
+      </w:r>
+    </w:p>
+    <w:p>
+      <w:pPr>
+        <w:spacing w:after="120"/>
+      </w:pPr>
+      <w:r>
+        <w:rPr>
+          <w:rFonts w:ascii="Arial" w:cs="Arial" w:eastAsia="Arial" w:hAnsi="Arial"/>
+          <w:b/>
+          <w:bCs/>
+          <w:color w:val="404040"/>
+          <w:sz w:val="22"/>
+          <w:szCs w:val="22"/>
+        </w:rPr>
+        <w:t xml:space="preserve">File naming convention:</w:t>
+      </w:r>
+    </w:p>
+    <w:p>
+      <w:pPr>
+        <w:pStyle w:val="ListParagraph"/>
+        <w:numPr>
+          <w:ilvl w:val="0"/>
+          <w:numId w:val="1"/>
+        </w:numPr>
+        <w:spacing w:after="60"/>
+      </w:pPr>
+      <w:r>
+        <w:rPr>
+          <w:rFonts w:ascii="Arial" w:cs="Arial" w:eastAsia="Arial" w:hAnsi="Arial"/>
+          <w:color w:val="404040"/>
+          <w:sz w:val="22"/>
+          <w:szCs w:val="22"/>
+        </w:rPr>
+        <w:t xml:space="preserve">Source: PRDs/{domain_code}/{PROCESS-CODE}-workflow.drawio</w:t>
+      </w:r>
+    </w:p>
+    <w:p>
+      <w:pPr>
+        <w:pStyle w:val="ListParagraph"/>
+        <w:numPr>
+          <w:ilvl w:val="0"/>
+          <w:numId w:val="1"/>
+        </w:numPr>
+        <w:spacing w:after="60"/>
+      </w:pPr>
+      <w:r>
+        <w:rPr>
+          <w:rFonts w:ascii="Arial" w:cs="Arial" w:eastAsia="Arial" w:hAnsi="Arial"/>
+          <w:color w:val="404040"/>
+          <w:sz w:val="22"/>
+          <w:szCs w:val="22"/>
+        </w:rPr>
+        <w:t xml:space="preserve">Export: PRDs/{domain_code}/{PROCESS-CODE}-workflow.png</w:t>
+      </w:r>
+    </w:p>
+    <w:p>
+      <w:pPr>
+        <w:spacing w:after="120"/>
+      </w:pPr>
+      <w:r>
+        <w:rPr>
+          <w:rFonts w:ascii="Arial" w:cs="Arial" w:eastAsia="Arial" w:hAnsi="Arial"/>
+          <w:b w:val="false"/>
+          <w:bCs w:val="false"/>
+          <w:i w:val="false"/>
+          <w:iCs w:val="false"/>
+          <w:color w:val="404040"/>
+          <w:sz w:val="22"/>
+          <w:szCs w:val="22"/>
+        </w:rPr>
+        <w:t xml:space="preserve">The process document generator template automatically embeds the PNG if it exists at the expected path. If no PNG is available, the generated document includes a labeled placeholder indicating where the diagram should be inserted. To update a diagram, edit the draw.io source file, re-export as PNG, and regenerate the document.</w:t>
       </w:r>
     </w:p>
     <w:p>

</xml_diff>